<commit_message>
Krishna Computer Cycber Cafe
version 2
</commit_message>
<xml_diff>
--- a/guidance/kon kon sa exam dalna hai is ke baad,.docx
+++ b/guidance/kon kon sa exam dalna hai is ke baad,.docx
@@ -19,7 +19,27 @@
           <w:szCs w:val="24"/>
           <w:lang w:eastAsia="en-IN"/>
         </w:rPr>
-        <w:t xml:space="preserve">Agar aapki website </w:t>
+        <w:t xml:space="preserve">Agar </w:t>
+      </w:r>
+      <w:proofErr w:type="spellStart"/>
+      <w:r>
+        <w:rPr>
+          <w:rFonts w:ascii="Times New Roman" w:eastAsia="Times New Roman" w:hAnsi="Times New Roman" w:cs="Times New Roman"/>
+          <w:sz w:val="24"/>
+          <w:szCs w:val="24"/>
+          <w:lang w:eastAsia="en-IN"/>
+        </w:rPr>
+        <w:t>aapki</w:t>
+      </w:r>
+      <w:proofErr w:type="spellEnd"/>
+      <w:r>
+        <w:rPr>
+          <w:rFonts w:ascii="Times New Roman" w:eastAsia="Times New Roman" w:hAnsi="Times New Roman" w:cs="Times New Roman"/>
+          <w:sz w:val="24"/>
+          <w:szCs w:val="24"/>
+          <w:lang w:eastAsia="en-IN"/>
+        </w:rPr>
+        <w:t xml:space="preserve"> website </w:t>
       </w:r>
       <w:r>
         <w:rPr>
@@ -39,7 +59,149 @@
           <w:szCs w:val="24"/>
           <w:lang w:eastAsia="en-IN"/>
         </w:rPr>
-        <w:t xml:space="preserve"> ke liye hai, to meri recommendation hai ki exams ko </w:t>
+        <w:t xml:space="preserve"> </w:t>
+      </w:r>
+      <w:proofErr w:type="spellStart"/>
+      <w:r>
+        <w:rPr>
+          <w:rFonts w:ascii="Times New Roman" w:eastAsia="Times New Roman" w:hAnsi="Times New Roman" w:cs="Times New Roman"/>
+          <w:sz w:val="24"/>
+          <w:szCs w:val="24"/>
+          <w:lang w:eastAsia="en-IN"/>
+        </w:rPr>
+        <w:t>ke</w:t>
+      </w:r>
+      <w:proofErr w:type="spellEnd"/>
+      <w:r>
+        <w:rPr>
+          <w:rFonts w:ascii="Times New Roman" w:eastAsia="Times New Roman" w:hAnsi="Times New Roman" w:cs="Times New Roman"/>
+          <w:sz w:val="24"/>
+          <w:szCs w:val="24"/>
+          <w:lang w:eastAsia="en-IN"/>
+        </w:rPr>
+        <w:t xml:space="preserve"> </w:t>
+      </w:r>
+      <w:proofErr w:type="spellStart"/>
+      <w:r>
+        <w:rPr>
+          <w:rFonts w:ascii="Times New Roman" w:eastAsia="Times New Roman" w:hAnsi="Times New Roman" w:cs="Times New Roman"/>
+          <w:sz w:val="24"/>
+          <w:szCs w:val="24"/>
+          <w:lang w:eastAsia="en-IN"/>
+        </w:rPr>
+        <w:t>liye</w:t>
+      </w:r>
+      <w:proofErr w:type="spellEnd"/>
+      <w:r>
+        <w:rPr>
+          <w:rFonts w:ascii="Times New Roman" w:eastAsia="Times New Roman" w:hAnsi="Times New Roman" w:cs="Times New Roman"/>
+          <w:sz w:val="24"/>
+          <w:szCs w:val="24"/>
+          <w:lang w:eastAsia="en-IN"/>
+        </w:rPr>
+        <w:t xml:space="preserve"> </w:t>
+      </w:r>
+      <w:proofErr w:type="spellStart"/>
+      <w:r>
+        <w:rPr>
+          <w:rFonts w:ascii="Times New Roman" w:eastAsia="Times New Roman" w:hAnsi="Times New Roman" w:cs="Times New Roman"/>
+          <w:sz w:val="24"/>
+          <w:szCs w:val="24"/>
+          <w:lang w:eastAsia="en-IN"/>
+        </w:rPr>
+        <w:t>hai</w:t>
+      </w:r>
+      <w:proofErr w:type="spellEnd"/>
+      <w:r>
+        <w:rPr>
+          <w:rFonts w:ascii="Times New Roman" w:eastAsia="Times New Roman" w:hAnsi="Times New Roman" w:cs="Times New Roman"/>
+          <w:sz w:val="24"/>
+          <w:szCs w:val="24"/>
+          <w:lang w:eastAsia="en-IN"/>
+        </w:rPr>
+        <w:t xml:space="preserve">, to </w:t>
+      </w:r>
+      <w:proofErr w:type="spellStart"/>
+      <w:r>
+        <w:rPr>
+          <w:rFonts w:ascii="Times New Roman" w:eastAsia="Times New Roman" w:hAnsi="Times New Roman" w:cs="Times New Roman"/>
+          <w:sz w:val="24"/>
+          <w:szCs w:val="24"/>
+          <w:lang w:eastAsia="en-IN"/>
+        </w:rPr>
+        <w:t>meri</w:t>
+      </w:r>
+      <w:proofErr w:type="spellEnd"/>
+      <w:r>
+        <w:rPr>
+          <w:rFonts w:ascii="Times New Roman" w:eastAsia="Times New Roman" w:hAnsi="Times New Roman" w:cs="Times New Roman"/>
+          <w:sz w:val="24"/>
+          <w:szCs w:val="24"/>
+          <w:lang w:eastAsia="en-IN"/>
+        </w:rPr>
+        <w:t xml:space="preserve"> recommendation </w:t>
+      </w:r>
+      <w:proofErr w:type="spellStart"/>
+      <w:r>
+        <w:rPr>
+          <w:rFonts w:ascii="Times New Roman" w:eastAsia="Times New Roman" w:hAnsi="Times New Roman" w:cs="Times New Roman"/>
+          <w:sz w:val="24"/>
+          <w:szCs w:val="24"/>
+          <w:lang w:eastAsia="en-IN"/>
+        </w:rPr>
+        <w:t>hai</w:t>
+      </w:r>
+      <w:proofErr w:type="spellEnd"/>
+      <w:r>
+        <w:rPr>
+          <w:rFonts w:ascii="Times New Roman" w:eastAsia="Times New Roman" w:hAnsi="Times New Roman" w:cs="Times New Roman"/>
+          <w:sz w:val="24"/>
+          <w:szCs w:val="24"/>
+          <w:lang w:eastAsia="en-IN"/>
+        </w:rPr>
+        <w:t xml:space="preserve"> </w:t>
+      </w:r>
+      <w:proofErr w:type="spellStart"/>
+      <w:r>
+        <w:rPr>
+          <w:rFonts w:ascii="Times New Roman" w:eastAsia="Times New Roman" w:hAnsi="Times New Roman" w:cs="Times New Roman"/>
+          <w:sz w:val="24"/>
+          <w:szCs w:val="24"/>
+          <w:lang w:eastAsia="en-IN"/>
+        </w:rPr>
+        <w:t>ki</w:t>
+      </w:r>
+      <w:proofErr w:type="spellEnd"/>
+      <w:r>
+        <w:rPr>
+          <w:rFonts w:ascii="Times New Roman" w:eastAsia="Times New Roman" w:hAnsi="Times New Roman" w:cs="Times New Roman"/>
+          <w:sz w:val="24"/>
+          <w:szCs w:val="24"/>
+          <w:lang w:eastAsia="en-IN"/>
+        </w:rPr>
+        <w:t xml:space="preserve"> exams </w:t>
+      </w:r>
+      <w:proofErr w:type="spellStart"/>
+      <w:proofErr w:type="gramStart"/>
+      <w:r>
+        <w:rPr>
+          <w:rFonts w:ascii="Times New Roman" w:eastAsia="Times New Roman" w:hAnsi="Times New Roman" w:cs="Times New Roman"/>
+          <w:sz w:val="24"/>
+          <w:szCs w:val="24"/>
+          <w:lang w:eastAsia="en-IN"/>
+        </w:rPr>
+        <w:t>ko</w:t>
+      </w:r>
+      <w:proofErr w:type="spellEnd"/>
+      <w:proofErr w:type="gramEnd"/>
+      <w:r>
+        <w:rPr>
+          <w:rFonts w:ascii="Times New Roman" w:eastAsia="Times New Roman" w:hAnsi="Times New Roman" w:cs="Times New Roman"/>
+          <w:sz w:val="24"/>
+          <w:szCs w:val="24"/>
+          <w:lang w:eastAsia="en-IN"/>
+        </w:rPr>
+        <w:t xml:space="preserve"> </w:t>
       </w:r>
       <w:r>
         <w:rPr>
@@ -50,36 +212,151 @@
           <w:szCs w:val="24"/>
           <w:lang w:eastAsia="en-IN"/>
         </w:rPr>
-        <w:t>search demand aur popularity</w:t>
-      </w:r>
-      <w:r>
-        <w:rPr>
-          <w:rFonts w:ascii="Times New Roman" w:eastAsia="Times New Roman" w:hAnsi="Times New Roman" w:cs="Times New Roman"/>
-          <w:sz w:val="24"/>
-          <w:szCs w:val="24"/>
-          <w:lang w:eastAsia="en-IN"/>
-        </w:rPr>
-        <w:t xml:space="preserve"> ke hisaab se add karein.</w:t>
-      </w:r>
-    </w:p>
-    <w:p>
-      <w:pPr>
-        <w:spacing w:before="100" w:beforeAutospacing="1" w:after="100" w:afterAutospacing="1" w:line="240" w:lineRule="auto"/>
-        <w:rPr>
-          <w:rFonts w:ascii="Times New Roman" w:eastAsia="Times New Roman" w:hAnsi="Times New Roman" w:cs="Times New Roman"/>
-          <w:sz w:val="24"/>
-          <w:szCs w:val="24"/>
-          <w:lang w:eastAsia="en-IN"/>
-        </w:rPr>
-      </w:pPr>
-      <w:r>
-        <w:rPr>
-          <w:rFonts w:ascii="Times New Roman" w:eastAsia="Times New Roman" w:hAnsi="Times New Roman" w:cs="Times New Roman"/>
-          <w:sz w:val="24"/>
-          <w:szCs w:val="24"/>
-          <w:lang w:eastAsia="en-IN"/>
-        </w:rPr>
-        <w:t>Abhi aapne:</w:t>
+        <w:t xml:space="preserve">search demand </w:t>
+      </w:r>
+      <w:proofErr w:type="spellStart"/>
+      <w:r>
+        <w:rPr>
+          <w:rFonts w:ascii="Times New Roman" w:eastAsia="Times New Roman" w:hAnsi="Times New Roman" w:cs="Times New Roman"/>
+          <w:b/>
+          <w:bCs/>
+          <w:sz w:val="24"/>
+          <w:szCs w:val="24"/>
+          <w:lang w:eastAsia="en-IN"/>
+        </w:rPr>
+        <w:t>aur</w:t>
+      </w:r>
+      <w:proofErr w:type="spellEnd"/>
+      <w:r>
+        <w:rPr>
+          <w:rFonts w:ascii="Times New Roman" w:eastAsia="Times New Roman" w:hAnsi="Times New Roman" w:cs="Times New Roman"/>
+          <w:b/>
+          <w:bCs/>
+          <w:sz w:val="24"/>
+          <w:szCs w:val="24"/>
+          <w:lang w:eastAsia="en-IN"/>
+        </w:rPr>
+        <w:t xml:space="preserve"> popularity</w:t>
+      </w:r>
+      <w:r>
+        <w:rPr>
+          <w:rFonts w:ascii="Times New Roman" w:eastAsia="Times New Roman" w:hAnsi="Times New Roman" w:cs="Times New Roman"/>
+          <w:sz w:val="24"/>
+          <w:szCs w:val="24"/>
+          <w:lang w:eastAsia="en-IN"/>
+        </w:rPr>
+        <w:t xml:space="preserve"> </w:t>
+      </w:r>
+      <w:proofErr w:type="spellStart"/>
+      <w:r>
+        <w:rPr>
+          <w:rFonts w:ascii="Times New Roman" w:eastAsia="Times New Roman" w:hAnsi="Times New Roman" w:cs="Times New Roman"/>
+          <w:sz w:val="24"/>
+          <w:szCs w:val="24"/>
+          <w:lang w:eastAsia="en-IN"/>
+        </w:rPr>
+        <w:t>ke</w:t>
+      </w:r>
+      <w:proofErr w:type="spellEnd"/>
+      <w:r>
+        <w:rPr>
+          <w:rFonts w:ascii="Times New Roman" w:eastAsia="Times New Roman" w:hAnsi="Times New Roman" w:cs="Times New Roman"/>
+          <w:sz w:val="24"/>
+          <w:szCs w:val="24"/>
+          <w:lang w:eastAsia="en-IN"/>
+        </w:rPr>
+        <w:t xml:space="preserve"> </w:t>
+      </w:r>
+      <w:proofErr w:type="spellStart"/>
+      <w:r>
+        <w:rPr>
+          <w:rFonts w:ascii="Times New Roman" w:eastAsia="Times New Roman" w:hAnsi="Times New Roman" w:cs="Times New Roman"/>
+          <w:sz w:val="24"/>
+          <w:szCs w:val="24"/>
+          <w:lang w:eastAsia="en-IN"/>
+        </w:rPr>
+        <w:t>hisaab</w:t>
+      </w:r>
+      <w:proofErr w:type="spellEnd"/>
+      <w:r>
+        <w:rPr>
+          <w:rFonts w:ascii="Times New Roman" w:eastAsia="Times New Roman" w:hAnsi="Times New Roman" w:cs="Times New Roman"/>
+          <w:sz w:val="24"/>
+          <w:szCs w:val="24"/>
+          <w:lang w:eastAsia="en-IN"/>
+        </w:rPr>
+        <w:t xml:space="preserve"> se add </w:t>
+      </w:r>
+      <w:proofErr w:type="spellStart"/>
+      <w:r>
+        <w:rPr>
+          <w:rFonts w:ascii="Times New Roman" w:eastAsia="Times New Roman" w:hAnsi="Times New Roman" w:cs="Times New Roman"/>
+          <w:sz w:val="24"/>
+          <w:szCs w:val="24"/>
+          <w:lang w:eastAsia="en-IN"/>
+        </w:rPr>
+        <w:t>karein</w:t>
+      </w:r>
+      <w:proofErr w:type="spellEnd"/>
+      <w:r>
+        <w:rPr>
+          <w:rFonts w:ascii="Times New Roman" w:eastAsia="Times New Roman" w:hAnsi="Times New Roman" w:cs="Times New Roman"/>
+          <w:sz w:val="24"/>
+          <w:szCs w:val="24"/>
+          <w:lang w:eastAsia="en-IN"/>
+        </w:rPr>
+        <w:t>.</w:t>
+      </w:r>
+    </w:p>
+    <w:p>
+      <w:pPr>
+        <w:spacing w:before="100" w:beforeAutospacing="1" w:after="100" w:afterAutospacing="1" w:line="240" w:lineRule="auto"/>
+        <w:rPr>
+          <w:rFonts w:ascii="Times New Roman" w:eastAsia="Times New Roman" w:hAnsi="Times New Roman" w:cs="Times New Roman"/>
+          <w:sz w:val="24"/>
+          <w:szCs w:val="24"/>
+          <w:lang w:eastAsia="en-IN"/>
+        </w:rPr>
+      </w:pPr>
+      <w:proofErr w:type="spellStart"/>
+      <w:r>
+        <w:rPr>
+          <w:rFonts w:ascii="Times New Roman" w:eastAsia="Times New Roman" w:hAnsi="Times New Roman" w:cs="Times New Roman"/>
+          <w:sz w:val="24"/>
+          <w:szCs w:val="24"/>
+          <w:lang w:eastAsia="en-IN"/>
+        </w:rPr>
+        <w:t>Abhi</w:t>
+      </w:r>
+      <w:proofErr w:type="spellEnd"/>
+      <w:r>
+        <w:rPr>
+          <w:rFonts w:ascii="Times New Roman" w:eastAsia="Times New Roman" w:hAnsi="Times New Roman" w:cs="Times New Roman"/>
+          <w:sz w:val="24"/>
+          <w:szCs w:val="24"/>
+          <w:lang w:eastAsia="en-IN"/>
+        </w:rPr>
+        <w:t xml:space="preserve"> </w:t>
+      </w:r>
+      <w:proofErr w:type="spellStart"/>
+      <w:r>
+        <w:rPr>
+          <w:rFonts w:ascii="Times New Roman" w:eastAsia="Times New Roman" w:hAnsi="Times New Roman" w:cs="Times New Roman"/>
+          <w:sz w:val="24"/>
+          <w:szCs w:val="24"/>
+          <w:lang w:eastAsia="en-IN"/>
+        </w:rPr>
+        <w:t>aapne</w:t>
+      </w:r>
+      <w:proofErr w:type="spellEnd"/>
+      <w:r>
+        <w:rPr>
+          <w:rFonts w:ascii="Times New Roman" w:eastAsia="Times New Roman" w:hAnsi="Times New Roman" w:cs="Times New Roman"/>
+          <w:sz w:val="24"/>
+          <w:szCs w:val="24"/>
+          <w:lang w:eastAsia="en-IN"/>
+        </w:rPr>
+        <w:t>:</w:t>
       </w:r>
     </w:p>
     <w:p>
@@ -191,34 +468,156 @@
           <w:lang w:eastAsia="en-IN"/>
         </w:rPr>
       </w:pPr>
-      <w:r>
-        <w:rPr>
-          <w:rFonts w:ascii="Times New Roman" w:eastAsia="Times New Roman" w:hAnsi="Times New Roman" w:cs="Times New Roman"/>
-          <w:sz w:val="24"/>
-          <w:szCs w:val="24"/>
-          <w:lang w:eastAsia="en-IN"/>
-        </w:rPr>
-        <w:t>Ye complete kar liye hain.</w:t>
-      </w:r>
-    </w:p>
-    <w:p>
-      <w:pPr>
-        <w:spacing w:before="100" w:beforeAutospacing="1" w:after="100" w:afterAutospacing="1" w:line="240" w:lineRule="auto"/>
-        <w:rPr>
-          <w:rFonts w:ascii="Times New Roman" w:eastAsia="Times New Roman" w:hAnsi="Times New Roman" w:cs="Times New Roman"/>
-          <w:sz w:val="24"/>
-          <w:szCs w:val="24"/>
-          <w:lang w:eastAsia="en-IN"/>
-        </w:rPr>
-      </w:pPr>
-      <w:r>
-        <w:rPr>
-          <w:rFonts w:ascii="Times New Roman" w:eastAsia="Times New Roman" w:hAnsi="Times New Roman" w:cs="Times New Roman"/>
-          <w:sz w:val="24"/>
-          <w:szCs w:val="24"/>
-          <w:lang w:eastAsia="en-IN"/>
-        </w:rPr>
-        <w:t>Ab is order me kaam kijiye:</w:t>
+      <w:proofErr w:type="spellStart"/>
+      <w:r>
+        <w:rPr>
+          <w:rFonts w:ascii="Times New Roman" w:eastAsia="Times New Roman" w:hAnsi="Times New Roman" w:cs="Times New Roman"/>
+          <w:sz w:val="24"/>
+          <w:szCs w:val="24"/>
+          <w:lang w:eastAsia="en-IN"/>
+        </w:rPr>
+        <w:t>Ye</w:t>
+      </w:r>
+      <w:proofErr w:type="spellEnd"/>
+      <w:r>
+        <w:rPr>
+          <w:rFonts w:ascii="Times New Roman" w:eastAsia="Times New Roman" w:hAnsi="Times New Roman" w:cs="Times New Roman"/>
+          <w:sz w:val="24"/>
+          <w:szCs w:val="24"/>
+          <w:lang w:eastAsia="en-IN"/>
+        </w:rPr>
+        <w:t xml:space="preserve"> complete </w:t>
+      </w:r>
+      <w:proofErr w:type="spellStart"/>
+      <w:r>
+        <w:rPr>
+          <w:rFonts w:ascii="Times New Roman" w:eastAsia="Times New Roman" w:hAnsi="Times New Roman" w:cs="Times New Roman"/>
+          <w:sz w:val="24"/>
+          <w:szCs w:val="24"/>
+          <w:lang w:eastAsia="en-IN"/>
+        </w:rPr>
+        <w:t>kar</w:t>
+      </w:r>
+      <w:proofErr w:type="spellEnd"/>
+      <w:r>
+        <w:rPr>
+          <w:rFonts w:ascii="Times New Roman" w:eastAsia="Times New Roman" w:hAnsi="Times New Roman" w:cs="Times New Roman"/>
+          <w:sz w:val="24"/>
+          <w:szCs w:val="24"/>
+          <w:lang w:eastAsia="en-IN"/>
+        </w:rPr>
+        <w:t xml:space="preserve"> </w:t>
+      </w:r>
+      <w:proofErr w:type="spellStart"/>
+      <w:r>
+        <w:rPr>
+          <w:rFonts w:ascii="Times New Roman" w:eastAsia="Times New Roman" w:hAnsi="Times New Roman" w:cs="Times New Roman"/>
+          <w:sz w:val="24"/>
+          <w:szCs w:val="24"/>
+          <w:lang w:eastAsia="en-IN"/>
+        </w:rPr>
+        <w:t>liye</w:t>
+      </w:r>
+      <w:proofErr w:type="spellEnd"/>
+      <w:r>
+        <w:rPr>
+          <w:rFonts w:ascii="Times New Roman" w:eastAsia="Times New Roman" w:hAnsi="Times New Roman" w:cs="Times New Roman"/>
+          <w:sz w:val="24"/>
+          <w:szCs w:val="24"/>
+          <w:lang w:eastAsia="en-IN"/>
+        </w:rPr>
+        <w:t xml:space="preserve"> </w:t>
+      </w:r>
+      <w:proofErr w:type="spellStart"/>
+      <w:r>
+        <w:rPr>
+          <w:rFonts w:ascii="Times New Roman" w:eastAsia="Times New Roman" w:hAnsi="Times New Roman" w:cs="Times New Roman"/>
+          <w:sz w:val="24"/>
+          <w:szCs w:val="24"/>
+          <w:lang w:eastAsia="en-IN"/>
+        </w:rPr>
+        <w:t>hain</w:t>
+      </w:r>
+      <w:proofErr w:type="spellEnd"/>
+      <w:r>
+        <w:rPr>
+          <w:rFonts w:ascii="Times New Roman" w:eastAsia="Times New Roman" w:hAnsi="Times New Roman" w:cs="Times New Roman"/>
+          <w:sz w:val="24"/>
+          <w:szCs w:val="24"/>
+          <w:lang w:eastAsia="en-IN"/>
+        </w:rPr>
+        <w:t>.</w:t>
+      </w:r>
+    </w:p>
+    <w:p>
+      <w:pPr>
+        <w:spacing w:before="100" w:beforeAutospacing="1" w:after="100" w:afterAutospacing="1" w:line="240" w:lineRule="auto"/>
+        <w:rPr>
+          <w:rFonts w:ascii="Times New Roman" w:eastAsia="Times New Roman" w:hAnsi="Times New Roman" w:cs="Times New Roman"/>
+          <w:sz w:val="24"/>
+          <w:szCs w:val="24"/>
+          <w:lang w:eastAsia="en-IN"/>
+        </w:rPr>
+      </w:pPr>
+      <w:proofErr w:type="spellStart"/>
+      <w:r>
+        <w:rPr>
+          <w:rFonts w:ascii="Times New Roman" w:eastAsia="Times New Roman" w:hAnsi="Times New Roman" w:cs="Times New Roman"/>
+          <w:sz w:val="24"/>
+          <w:szCs w:val="24"/>
+          <w:lang w:eastAsia="en-IN"/>
+        </w:rPr>
+        <w:t>Ab</w:t>
+      </w:r>
+      <w:proofErr w:type="spellEnd"/>
+      <w:r>
+        <w:rPr>
+          <w:rFonts w:ascii="Times New Roman" w:eastAsia="Times New Roman" w:hAnsi="Times New Roman" w:cs="Times New Roman"/>
+          <w:sz w:val="24"/>
+          <w:szCs w:val="24"/>
+          <w:lang w:eastAsia="en-IN"/>
+        </w:rPr>
+        <w:t xml:space="preserve"> is order me </w:t>
+      </w:r>
+      <w:proofErr w:type="spellStart"/>
+      <w:r>
+        <w:rPr>
+          <w:rFonts w:ascii="Times New Roman" w:eastAsia="Times New Roman" w:hAnsi="Times New Roman" w:cs="Times New Roman"/>
+          <w:sz w:val="24"/>
+          <w:szCs w:val="24"/>
+          <w:lang w:eastAsia="en-IN"/>
+        </w:rPr>
+        <w:t>kaam</w:t>
+      </w:r>
+      <w:proofErr w:type="spellEnd"/>
+      <w:r>
+        <w:rPr>
+          <w:rFonts w:ascii="Times New Roman" w:eastAsia="Times New Roman" w:hAnsi="Times New Roman" w:cs="Times New Roman"/>
+          <w:sz w:val="24"/>
+          <w:szCs w:val="24"/>
+          <w:lang w:eastAsia="en-IN"/>
+        </w:rPr>
+        <w:t xml:space="preserve"> </w:t>
+      </w:r>
+      <w:proofErr w:type="spellStart"/>
+      <w:r>
+        <w:rPr>
+          <w:rFonts w:ascii="Times New Roman" w:eastAsia="Times New Roman" w:hAnsi="Times New Roman" w:cs="Times New Roman"/>
+          <w:sz w:val="24"/>
+          <w:szCs w:val="24"/>
+          <w:lang w:eastAsia="en-IN"/>
+        </w:rPr>
+        <w:t>kijiye</w:t>
+      </w:r>
+      <w:proofErr w:type="spellEnd"/>
+      <w:r>
+        <w:rPr>
+          <w:rFonts w:ascii="Times New Roman" w:eastAsia="Times New Roman" w:hAnsi="Times New Roman" w:cs="Times New Roman"/>
+          <w:sz w:val="24"/>
+          <w:szCs w:val="24"/>
+          <w:lang w:eastAsia="en-IN"/>
+        </w:rPr>
+        <w:t>:</w:t>
       </w:r>
     </w:p>
     <w:p>
@@ -947,6 +1346,7 @@
           <w:lang w:eastAsia="en-IN"/>
         </w:rPr>
       </w:pPr>
+      <w:proofErr w:type="spellStart"/>
       <w:r>
         <w:rPr>
           <w:rFonts w:ascii="Times New Roman" w:eastAsia="Times New Roman" w:hAnsi="Times New Roman" w:cs="Times New Roman"/>
@@ -956,6 +1356,7 @@
         </w:rPr>
         <w:t>Agniveer</w:t>
       </w:r>
+      <w:proofErr w:type="spellEnd"/>
     </w:p>
     <w:p>
       <w:pPr>
@@ -1045,6 +1446,7 @@
           <w:lang w:eastAsia="en-IN"/>
         </w:rPr>
       </w:pPr>
+      <w:proofErr w:type="spellStart"/>
       <w:r>
         <w:rPr>
           <w:rFonts w:ascii="Times New Roman" w:eastAsia="Times New Roman" w:hAnsi="Times New Roman" w:cs="Times New Roman"/>
@@ -1054,6 +1456,7 @@
         </w:rPr>
         <w:t>Lekhpal</w:t>
       </w:r>
+      <w:proofErr w:type="spellEnd"/>
     </w:p>
     <w:p>
       <w:pPr>
@@ -1069,6 +1472,7 @@
           <w:lang w:eastAsia="en-IN"/>
         </w:rPr>
       </w:pPr>
+      <w:proofErr w:type="spellStart"/>
       <w:r>
         <w:rPr>
           <w:rFonts w:ascii="Times New Roman" w:eastAsia="Times New Roman" w:hAnsi="Times New Roman" w:cs="Times New Roman"/>
@@ -1078,6 +1482,7 @@
         </w:rPr>
         <w:t>Patwari</w:t>
       </w:r>
+      <w:proofErr w:type="spellEnd"/>
     </w:p>
     <w:p>
       <w:pPr>
@@ -1124,7 +1529,27 @@
           <w:szCs w:val="24"/>
           <w:lang w:eastAsia="en-IN"/>
         </w:rPr>
-        <w:t>Gram Panchayat Officer</w:t>
+        <w:t xml:space="preserve">Gram </w:t>
+      </w:r>
+      <w:proofErr w:type="spellStart"/>
+      <w:r>
+        <w:rPr>
+          <w:rFonts w:ascii="Times New Roman" w:eastAsia="Times New Roman" w:hAnsi="Times New Roman" w:cs="Times New Roman"/>
+          <w:sz w:val="24"/>
+          <w:szCs w:val="24"/>
+          <w:lang w:eastAsia="en-IN"/>
+        </w:rPr>
+        <w:t>Panchayat</w:t>
+      </w:r>
+      <w:proofErr w:type="spellEnd"/>
+      <w:r>
+        <w:rPr>
+          <w:rFonts w:ascii="Times New Roman" w:eastAsia="Times New Roman" w:hAnsi="Times New Roman" w:cs="Times New Roman"/>
+          <w:sz w:val="24"/>
+          <w:szCs w:val="24"/>
+          <w:lang w:eastAsia="en-IN"/>
+        </w:rPr>
+        <w:t xml:space="preserve"> Officer</w:t>
       </w:r>
     </w:p>
     <w:p>
@@ -1394,7 +1819,103 @@
           <w:szCs w:val="36"/>
           <w:lang w:eastAsia="en-IN"/>
         </w:rPr>
-        <w:t>Agar Google Traffic jaldi chahiye to meri priority ye hogi:</w:t>
+        <w:t xml:space="preserve">Agar Google Traffic </w:t>
+      </w:r>
+      <w:proofErr w:type="spellStart"/>
+      <w:r>
+        <w:rPr>
+          <w:rFonts w:ascii="Times New Roman" w:eastAsia="Times New Roman" w:hAnsi="Times New Roman" w:cs="Times New Roman"/>
+          <w:b/>
+          <w:bCs/>
+          <w:sz w:val="36"/>
+          <w:szCs w:val="36"/>
+          <w:lang w:eastAsia="en-IN"/>
+        </w:rPr>
+        <w:t>jaldi</w:t>
+      </w:r>
+      <w:proofErr w:type="spellEnd"/>
+      <w:r>
+        <w:rPr>
+          <w:rFonts w:ascii="Times New Roman" w:eastAsia="Times New Roman" w:hAnsi="Times New Roman" w:cs="Times New Roman"/>
+          <w:b/>
+          <w:bCs/>
+          <w:sz w:val="36"/>
+          <w:szCs w:val="36"/>
+          <w:lang w:eastAsia="en-IN"/>
+        </w:rPr>
+        <w:t xml:space="preserve"> </w:t>
+      </w:r>
+      <w:proofErr w:type="spellStart"/>
+      <w:r>
+        <w:rPr>
+          <w:rFonts w:ascii="Times New Roman" w:eastAsia="Times New Roman" w:hAnsi="Times New Roman" w:cs="Times New Roman"/>
+          <w:b/>
+          <w:bCs/>
+          <w:sz w:val="36"/>
+          <w:szCs w:val="36"/>
+          <w:lang w:eastAsia="en-IN"/>
+        </w:rPr>
+        <w:t>chahiye</w:t>
+      </w:r>
+      <w:proofErr w:type="spellEnd"/>
+      <w:r>
+        <w:rPr>
+          <w:rFonts w:ascii="Times New Roman" w:eastAsia="Times New Roman" w:hAnsi="Times New Roman" w:cs="Times New Roman"/>
+          <w:b/>
+          <w:bCs/>
+          <w:sz w:val="36"/>
+          <w:szCs w:val="36"/>
+          <w:lang w:eastAsia="en-IN"/>
+        </w:rPr>
+        <w:t xml:space="preserve"> to </w:t>
+      </w:r>
+      <w:proofErr w:type="spellStart"/>
+      <w:r>
+        <w:rPr>
+          <w:rFonts w:ascii="Times New Roman" w:eastAsia="Times New Roman" w:hAnsi="Times New Roman" w:cs="Times New Roman"/>
+          <w:b/>
+          <w:bCs/>
+          <w:sz w:val="36"/>
+          <w:szCs w:val="36"/>
+          <w:lang w:eastAsia="en-IN"/>
+        </w:rPr>
+        <w:t>meri</w:t>
+      </w:r>
+      <w:proofErr w:type="spellEnd"/>
+      <w:r>
+        <w:rPr>
+          <w:rFonts w:ascii="Times New Roman" w:eastAsia="Times New Roman" w:hAnsi="Times New Roman" w:cs="Times New Roman"/>
+          <w:b/>
+          <w:bCs/>
+          <w:sz w:val="36"/>
+          <w:szCs w:val="36"/>
+          <w:lang w:eastAsia="en-IN"/>
+        </w:rPr>
+        <w:t xml:space="preserve"> priority ye </w:t>
+      </w:r>
+      <w:proofErr w:type="spellStart"/>
+      <w:r>
+        <w:rPr>
+          <w:rFonts w:ascii="Times New Roman" w:eastAsia="Times New Roman" w:hAnsi="Times New Roman" w:cs="Times New Roman"/>
+          <w:b/>
+          <w:bCs/>
+          <w:sz w:val="36"/>
+          <w:szCs w:val="36"/>
+          <w:lang w:eastAsia="en-IN"/>
+        </w:rPr>
+        <w:t>hogi</w:t>
+      </w:r>
+      <w:proofErr w:type="spellEnd"/>
+      <w:r>
+        <w:rPr>
+          <w:rFonts w:ascii="Times New Roman" w:eastAsia="Times New Roman" w:hAnsi="Times New Roman" w:cs="Times New Roman"/>
+          <w:b/>
+          <w:bCs/>
+          <w:sz w:val="36"/>
+          <w:szCs w:val="36"/>
+          <w:lang w:eastAsia="en-IN"/>
+        </w:rPr>
+        <w:t>:</w:t>
       </w:r>
     </w:p>
     <w:p>
@@ -1654,6 +2175,8 @@
           <w:lang w:eastAsia="en-IN"/>
         </w:rPr>
       </w:pPr>
+      <w:bookmarkStart w:id="0" w:name="_GoBack"/>
+      <w:bookmarkEnd w:id="0"/>
       <w:r>
         <w:rPr>
           <w:rFonts w:ascii="Times New Roman" w:eastAsia="Times New Roman" w:hAnsi="Times New Roman" w:cs="Times New Roman"/>
@@ -1683,22 +2206,323 @@
           <w:szCs w:val="24"/>
           <w:lang w:eastAsia="en-IN"/>
         </w:rPr>
-        <w:t>Railway aur PCS</w:t>
-      </w:r>
-      <w:r>
-        <w:rPr>
-          <w:rFonts w:ascii="Times New Roman" w:eastAsia="Times New Roman" w:hAnsi="Times New Roman" w:cs="Times New Roman"/>
-          <w:sz w:val="24"/>
-          <w:szCs w:val="24"/>
-          <w:lang w:eastAsia="en-IN"/>
-        </w:rPr>
-        <w:t xml:space="preserve"> ke pages banane ke baad aapki website par kaafi popular exam categories cover ho jayengi. Uske baad Police aur Teaching exams add karna achha rahega.</w:t>
-      </w:r>
-    </w:p>
-    <w:p>
-      <w:bookmarkStart w:id="0" w:name="_GoBack"/>
-      <w:bookmarkEnd w:id="0"/>
-    </w:p>
+        <w:t xml:space="preserve">Railway </w:t>
+      </w:r>
+      <w:proofErr w:type="spellStart"/>
+      <w:r>
+        <w:rPr>
+          <w:rFonts w:ascii="Times New Roman" w:eastAsia="Times New Roman" w:hAnsi="Times New Roman" w:cs="Times New Roman"/>
+          <w:b/>
+          <w:bCs/>
+          <w:sz w:val="24"/>
+          <w:szCs w:val="24"/>
+          <w:lang w:eastAsia="en-IN"/>
+        </w:rPr>
+        <w:t>aur</w:t>
+      </w:r>
+      <w:proofErr w:type="spellEnd"/>
+      <w:r>
+        <w:rPr>
+          <w:rFonts w:ascii="Times New Roman" w:eastAsia="Times New Roman" w:hAnsi="Times New Roman" w:cs="Times New Roman"/>
+          <w:b/>
+          <w:bCs/>
+          <w:sz w:val="24"/>
+          <w:szCs w:val="24"/>
+          <w:lang w:eastAsia="en-IN"/>
+        </w:rPr>
+        <w:t xml:space="preserve"> PCS</w:t>
+      </w:r>
+      <w:r>
+        <w:rPr>
+          <w:rFonts w:ascii="Times New Roman" w:eastAsia="Times New Roman" w:hAnsi="Times New Roman" w:cs="Times New Roman"/>
+          <w:sz w:val="24"/>
+          <w:szCs w:val="24"/>
+          <w:lang w:eastAsia="en-IN"/>
+        </w:rPr>
+        <w:t xml:space="preserve"> </w:t>
+      </w:r>
+      <w:proofErr w:type="spellStart"/>
+      <w:r>
+        <w:rPr>
+          <w:rFonts w:ascii="Times New Roman" w:eastAsia="Times New Roman" w:hAnsi="Times New Roman" w:cs="Times New Roman"/>
+          <w:sz w:val="24"/>
+          <w:szCs w:val="24"/>
+          <w:lang w:eastAsia="en-IN"/>
+        </w:rPr>
+        <w:t>ke</w:t>
+      </w:r>
+      <w:proofErr w:type="spellEnd"/>
+      <w:r>
+        <w:rPr>
+          <w:rFonts w:ascii="Times New Roman" w:eastAsia="Times New Roman" w:hAnsi="Times New Roman" w:cs="Times New Roman"/>
+          <w:sz w:val="24"/>
+          <w:szCs w:val="24"/>
+          <w:lang w:eastAsia="en-IN"/>
+        </w:rPr>
+        <w:t xml:space="preserve"> pages </w:t>
+      </w:r>
+      <w:proofErr w:type="spellStart"/>
+      <w:r>
+        <w:rPr>
+          <w:rFonts w:ascii="Times New Roman" w:eastAsia="Times New Roman" w:hAnsi="Times New Roman" w:cs="Times New Roman"/>
+          <w:sz w:val="24"/>
+          <w:szCs w:val="24"/>
+          <w:lang w:eastAsia="en-IN"/>
+        </w:rPr>
+        <w:t>banane</w:t>
+      </w:r>
+      <w:proofErr w:type="spellEnd"/>
+      <w:r>
+        <w:rPr>
+          <w:rFonts w:ascii="Times New Roman" w:eastAsia="Times New Roman" w:hAnsi="Times New Roman" w:cs="Times New Roman"/>
+          <w:sz w:val="24"/>
+          <w:szCs w:val="24"/>
+          <w:lang w:eastAsia="en-IN"/>
+        </w:rPr>
+        <w:t xml:space="preserve"> </w:t>
+      </w:r>
+      <w:proofErr w:type="spellStart"/>
+      <w:r>
+        <w:rPr>
+          <w:rFonts w:ascii="Times New Roman" w:eastAsia="Times New Roman" w:hAnsi="Times New Roman" w:cs="Times New Roman"/>
+          <w:sz w:val="24"/>
+          <w:szCs w:val="24"/>
+          <w:lang w:eastAsia="en-IN"/>
+        </w:rPr>
+        <w:t>ke</w:t>
+      </w:r>
+      <w:proofErr w:type="spellEnd"/>
+      <w:r>
+        <w:rPr>
+          <w:rFonts w:ascii="Times New Roman" w:eastAsia="Times New Roman" w:hAnsi="Times New Roman" w:cs="Times New Roman"/>
+          <w:sz w:val="24"/>
+          <w:szCs w:val="24"/>
+          <w:lang w:eastAsia="en-IN"/>
+        </w:rPr>
+        <w:t xml:space="preserve"> </w:t>
+      </w:r>
+      <w:proofErr w:type="spellStart"/>
+      <w:r>
+        <w:rPr>
+          <w:rFonts w:ascii="Times New Roman" w:eastAsia="Times New Roman" w:hAnsi="Times New Roman" w:cs="Times New Roman"/>
+          <w:sz w:val="24"/>
+          <w:szCs w:val="24"/>
+          <w:lang w:eastAsia="en-IN"/>
+        </w:rPr>
+        <w:t>baad</w:t>
+      </w:r>
+      <w:proofErr w:type="spellEnd"/>
+      <w:r>
+        <w:rPr>
+          <w:rFonts w:ascii="Times New Roman" w:eastAsia="Times New Roman" w:hAnsi="Times New Roman" w:cs="Times New Roman"/>
+          <w:sz w:val="24"/>
+          <w:szCs w:val="24"/>
+          <w:lang w:eastAsia="en-IN"/>
+        </w:rPr>
+        <w:t xml:space="preserve"> </w:t>
+      </w:r>
+      <w:proofErr w:type="spellStart"/>
+      <w:r>
+        <w:rPr>
+          <w:rFonts w:ascii="Times New Roman" w:eastAsia="Times New Roman" w:hAnsi="Times New Roman" w:cs="Times New Roman"/>
+          <w:sz w:val="24"/>
+          <w:szCs w:val="24"/>
+          <w:lang w:eastAsia="en-IN"/>
+        </w:rPr>
+        <w:t>aapki</w:t>
+      </w:r>
+      <w:proofErr w:type="spellEnd"/>
+      <w:r>
+        <w:rPr>
+          <w:rFonts w:ascii="Times New Roman" w:eastAsia="Times New Roman" w:hAnsi="Times New Roman" w:cs="Times New Roman"/>
+          <w:sz w:val="24"/>
+          <w:szCs w:val="24"/>
+          <w:lang w:eastAsia="en-IN"/>
+        </w:rPr>
+        <w:t xml:space="preserve"> website par </w:t>
+      </w:r>
+      <w:proofErr w:type="spellStart"/>
+      <w:r>
+        <w:rPr>
+          <w:rFonts w:ascii="Times New Roman" w:eastAsia="Times New Roman" w:hAnsi="Times New Roman" w:cs="Times New Roman"/>
+          <w:sz w:val="24"/>
+          <w:szCs w:val="24"/>
+          <w:lang w:eastAsia="en-IN"/>
+        </w:rPr>
+        <w:t>kaafi</w:t>
+      </w:r>
+      <w:proofErr w:type="spellEnd"/>
+      <w:r>
+        <w:rPr>
+          <w:rFonts w:ascii="Times New Roman" w:eastAsia="Times New Roman" w:hAnsi="Times New Roman" w:cs="Times New Roman"/>
+          <w:sz w:val="24"/>
+          <w:szCs w:val="24"/>
+          <w:lang w:eastAsia="en-IN"/>
+        </w:rPr>
+        <w:t xml:space="preserve"> popular exam categories cover </w:t>
+      </w:r>
+      <w:proofErr w:type="spellStart"/>
+      <w:r>
+        <w:rPr>
+          <w:rFonts w:ascii="Times New Roman" w:eastAsia="Times New Roman" w:hAnsi="Times New Roman" w:cs="Times New Roman"/>
+          <w:sz w:val="24"/>
+          <w:szCs w:val="24"/>
+          <w:lang w:eastAsia="en-IN"/>
+        </w:rPr>
+        <w:t>ho</w:t>
+      </w:r>
+      <w:proofErr w:type="spellEnd"/>
+      <w:r>
+        <w:rPr>
+          <w:rFonts w:ascii="Times New Roman" w:eastAsia="Times New Roman" w:hAnsi="Times New Roman" w:cs="Times New Roman"/>
+          <w:sz w:val="24"/>
+          <w:szCs w:val="24"/>
+          <w:lang w:eastAsia="en-IN"/>
+        </w:rPr>
+        <w:t xml:space="preserve"> </w:t>
+      </w:r>
+      <w:proofErr w:type="spellStart"/>
+      <w:r>
+        <w:rPr>
+          <w:rFonts w:ascii="Times New Roman" w:eastAsia="Times New Roman" w:hAnsi="Times New Roman" w:cs="Times New Roman"/>
+          <w:sz w:val="24"/>
+          <w:szCs w:val="24"/>
+          <w:lang w:eastAsia="en-IN"/>
+        </w:rPr>
+        <w:t>jayengi</w:t>
+      </w:r>
+      <w:proofErr w:type="spellEnd"/>
+      <w:r>
+        <w:rPr>
+          <w:rFonts w:ascii="Times New Roman" w:eastAsia="Times New Roman" w:hAnsi="Times New Roman" w:cs="Times New Roman"/>
+          <w:sz w:val="24"/>
+          <w:szCs w:val="24"/>
+          <w:lang w:eastAsia="en-IN"/>
+        </w:rPr>
+        <w:t xml:space="preserve">. </w:t>
+      </w:r>
+      <w:proofErr w:type="spellStart"/>
+      <w:r>
+        <w:rPr>
+          <w:rFonts w:ascii="Times New Roman" w:eastAsia="Times New Roman" w:hAnsi="Times New Roman" w:cs="Times New Roman"/>
+          <w:sz w:val="24"/>
+          <w:szCs w:val="24"/>
+          <w:lang w:eastAsia="en-IN"/>
+        </w:rPr>
+        <w:t>Uske</w:t>
+      </w:r>
+      <w:proofErr w:type="spellEnd"/>
+      <w:r>
+        <w:rPr>
+          <w:rFonts w:ascii="Times New Roman" w:eastAsia="Times New Roman" w:hAnsi="Times New Roman" w:cs="Times New Roman"/>
+          <w:sz w:val="24"/>
+          <w:szCs w:val="24"/>
+          <w:lang w:eastAsia="en-IN"/>
+        </w:rPr>
+        <w:t xml:space="preserve"> </w:t>
+      </w:r>
+      <w:proofErr w:type="spellStart"/>
+      <w:r>
+        <w:rPr>
+          <w:rFonts w:ascii="Times New Roman" w:eastAsia="Times New Roman" w:hAnsi="Times New Roman" w:cs="Times New Roman"/>
+          <w:sz w:val="24"/>
+          <w:szCs w:val="24"/>
+          <w:lang w:eastAsia="en-IN"/>
+        </w:rPr>
+        <w:t>baad</w:t>
+      </w:r>
+      <w:proofErr w:type="spellEnd"/>
+      <w:r>
+        <w:rPr>
+          <w:rFonts w:ascii="Times New Roman" w:eastAsia="Times New Roman" w:hAnsi="Times New Roman" w:cs="Times New Roman"/>
+          <w:sz w:val="24"/>
+          <w:szCs w:val="24"/>
+          <w:lang w:eastAsia="en-IN"/>
+        </w:rPr>
+        <w:t xml:space="preserve"> Police </w:t>
+      </w:r>
+      <w:proofErr w:type="spellStart"/>
+      <w:r>
+        <w:rPr>
+          <w:rFonts w:ascii="Times New Roman" w:eastAsia="Times New Roman" w:hAnsi="Times New Roman" w:cs="Times New Roman"/>
+          <w:sz w:val="24"/>
+          <w:szCs w:val="24"/>
+          <w:lang w:eastAsia="en-IN"/>
+        </w:rPr>
+        <w:t>aur</w:t>
+      </w:r>
+      <w:proofErr w:type="spellEnd"/>
+      <w:r>
+        <w:rPr>
+          <w:rFonts w:ascii="Times New Roman" w:eastAsia="Times New Roman" w:hAnsi="Times New Roman" w:cs="Times New Roman"/>
+          <w:sz w:val="24"/>
+          <w:szCs w:val="24"/>
+          <w:lang w:eastAsia="en-IN"/>
+        </w:rPr>
+        <w:t xml:space="preserve"> Teaching exams add </w:t>
+      </w:r>
+      <w:proofErr w:type="spellStart"/>
+      <w:r>
+        <w:rPr>
+          <w:rFonts w:ascii="Times New Roman" w:eastAsia="Times New Roman" w:hAnsi="Times New Roman" w:cs="Times New Roman"/>
+          <w:sz w:val="24"/>
+          <w:szCs w:val="24"/>
+          <w:lang w:eastAsia="en-IN"/>
+        </w:rPr>
+        <w:t>karna</w:t>
+      </w:r>
+      <w:proofErr w:type="spellEnd"/>
+      <w:r>
+        <w:rPr>
+          <w:rFonts w:ascii="Times New Roman" w:eastAsia="Times New Roman" w:hAnsi="Times New Roman" w:cs="Times New Roman"/>
+          <w:sz w:val="24"/>
+          <w:szCs w:val="24"/>
+          <w:lang w:eastAsia="en-IN"/>
+        </w:rPr>
+        <w:t xml:space="preserve"> </w:t>
+      </w:r>
+      <w:proofErr w:type="spellStart"/>
+      <w:r>
+        <w:rPr>
+          <w:rFonts w:ascii="Times New Roman" w:eastAsia="Times New Roman" w:hAnsi="Times New Roman" w:cs="Times New Roman"/>
+          <w:sz w:val="24"/>
+          <w:szCs w:val="24"/>
+          <w:lang w:eastAsia="en-IN"/>
+        </w:rPr>
+        <w:t>achha</w:t>
+      </w:r>
+      <w:proofErr w:type="spellEnd"/>
+      <w:r>
+        <w:rPr>
+          <w:rFonts w:ascii="Times New Roman" w:eastAsia="Times New Roman" w:hAnsi="Times New Roman" w:cs="Times New Roman"/>
+          <w:sz w:val="24"/>
+          <w:szCs w:val="24"/>
+          <w:lang w:eastAsia="en-IN"/>
+        </w:rPr>
+        <w:t xml:space="preserve"> </w:t>
+      </w:r>
+      <w:proofErr w:type="spellStart"/>
+      <w:r>
+        <w:rPr>
+          <w:rFonts w:ascii="Times New Roman" w:eastAsia="Times New Roman" w:hAnsi="Times New Roman" w:cs="Times New Roman"/>
+          <w:sz w:val="24"/>
+          <w:szCs w:val="24"/>
+          <w:lang w:eastAsia="en-IN"/>
+        </w:rPr>
+        <w:t>rahega</w:t>
+      </w:r>
+      <w:proofErr w:type="spellEnd"/>
+      <w:r>
+        <w:rPr>
+          <w:rFonts w:ascii="Times New Roman" w:eastAsia="Times New Roman" w:hAnsi="Times New Roman" w:cs="Times New Roman"/>
+          <w:sz w:val="24"/>
+          <w:szCs w:val="24"/>
+          <w:lang w:eastAsia="en-IN"/>
+        </w:rPr>
+        <w:t>.</w:t>
+      </w:r>
+    </w:p>
+    <w:p/>
     <w:sectPr>
       <w:pgSz w:w="11906" w:h="16838"/>
       <w:pgMar w:top="1440" w:right="1440" w:bottom="1440" w:left="1440" w:header="708" w:footer="708" w:gutter="0"/>

</xml_diff>